<commit_message>
Log the reviewer landing diagnosis
Co-Authored-By: Claude Opus 5 <noreply@anthropic.com>
Claude-Session: https://claude.ai/code/session_01W9UtE7X76spacWeSvBH7tv
</commit_message>
<xml_diff>
--- a/MASTER_TRACKER.docx
+++ b/MASTER_TRACKER.docx
@@ -3811,6 +3811,1164 @@
       </w:r>
       <w:r>
         <w:t xml:space="preserve"> from the previous run is retained.</w:t>
+      </w:r>
+    </w:p>
+    <w:p>
+      <w:pPr>
+        <w:pBdr>
+          <w:bottom w:val="single" w:sz="6" w:space="1" w:color="AAAAAA"/>
+        </w:pBdr>
+      </w:pPr>
+    </w:p>
+    <w:p>
+      <w:pPr>
+        <w:pStyle w:val="Heading2"/>
+        <w:spacing w:after="140"/>
+      </w:pPr>
+      <w:r>
+        <w:t xml:space="preserve">Run: 2026-08-12T12:32:13Z</w:t>
+      </w:r>
+    </w:p>
+    <w:p>
+      <w:pPr>
+        <w:spacing w:after="140"/>
+      </w:pPr>
+      <w:r>
+        <w:rPr>
+          <w:b/>
+        </w:rPr>
+        <w:t xml:space="preserve">Counter audit: DRIFT DETECTED (presentation), then PATCHED. Link-click telemetry: no defect found this run.</w:t>
+      </w:r>
+    </w:p>
+    <w:p>
+      <w:pPr>
+        <w:pStyle w:val="Heading3"/>
+        <w:spacing w:after="140"/>
+      </w:pPr>
+      <w:r>
+        <w:t xml:space="preserve">The question</w:t>
+      </w:r>
+    </w:p>
+    <w:p>
+      <w:pPr>
+        <w:spacing w:after="140"/>
+      </w:pPr>
+      <w:r>
+        <w:t xml:space="preserve">What does "3 reviewer landing arrivals" mean, did they open the evaluation, and did we capture their information.</w:t>
+      </w:r>
+    </w:p>
+    <w:p>
+      <w:pPr>
+        <w:pStyle w:val="Heading3"/>
+        <w:spacing w:after="140"/>
+      </w:pPr>
+      <w:r>
+        <w:t xml:space="preserve">The answer, from the database</w:t>
+      </w:r>
+    </w:p>
+    <w:tbl>
+      <w:tblPr>
+        <w:tblStyle w:val="TableGrid"/>
+        <w:tblW w:w="9360" w:type="dxa"/>
+        <w:tblBorders>
+          <w:top w:val="single" w:sz="4" w:space="0" w:color="999999"/>
+          <w:left w:val="single" w:sz="4" w:space="0" w:color="999999"/>
+          <w:bottom w:val="single" w:sz="4" w:space="0" w:color="999999"/>
+          <w:right w:val="single" w:sz="4" w:space="0" w:color="999999"/>
+          <w:insideH w:val="single" w:sz="4" w:space="0" w:color="999999"/>
+          <w:insideV w:val="single" w:sz="4" w:space="0" w:color="999999"/>
+        </w:tblBorders>
+      </w:tblPr>
+      <w:tblGrid>
+        <w:gridCol w:w="1872"/>
+        <w:gridCol w:w="1872"/>
+        <w:gridCol w:w="1872"/>
+        <w:gridCol w:w="1872"/>
+        <w:gridCol w:w="1872"/>
+      </w:tblGrid>
+      <w:tr>
+        <w:tc>
+          <w:tcPr>
+            <w:tcW w:w="1872" w:type="dxa"/>
+          </w:tcPr>
+          <w:p>
+            <w:pPr>
+              <w:spacing w:after="0"/>
+            </w:pPr>
+            <w:r>
+              <w:t xml:space="preserve">Time (UTC)</w:t>
+            </w:r>
+          </w:p>
+        </w:tc>
+        <w:tc>
+          <w:tcPr>
+            <w:tcW w:w="1872" w:type="dxa"/>
+          </w:tcPr>
+          <w:p>
+            <w:pPr>
+              <w:spacing w:after="0"/>
+            </w:pPr>
+            <w:r>
+              <w:t xml:space="preserve">Source</w:t>
+            </w:r>
+          </w:p>
+        </w:tc>
+        <w:tc>
+          <w:tcPr>
+            <w:tcW w:w="1872" w:type="dxa"/>
+          </w:tcPr>
+          <w:p>
+            <w:pPr>
+              <w:spacing w:after="0"/>
+            </w:pPr>
+            <w:r>
+              <w:t xml:space="preserve">Country</w:t>
+            </w:r>
+          </w:p>
+        </w:tc>
+        <w:tc>
+          <w:tcPr>
+            <w:tcW w:w="1872" w:type="dxa"/>
+          </w:tcPr>
+          <w:p>
+            <w:pPr>
+              <w:spacing w:after="0"/>
+            </w:pPr>
+            <w:r>
+              <w:t xml:space="preserve">Device</w:t>
+            </w:r>
+          </w:p>
+        </w:tc>
+        <w:tc>
+          <w:tcPr>
+            <w:tcW w:w="1872" w:type="dxa"/>
+          </w:tcPr>
+          <w:p>
+            <w:pPr>
+              <w:spacing w:after="0"/>
+            </w:pPr>
+            <w:r>
+              <w:t xml:space="preserve">Crawler</w:t>
+            </w:r>
+          </w:p>
+        </w:tc>
+      </w:tr>
+      <w:tr>
+        <w:tc>
+          <w:tcPr>
+            <w:tcW w:w="1872" w:type="dxa"/>
+          </w:tcPr>
+          <w:p>
+            <w:pPr>
+              <w:spacing w:after="0"/>
+            </w:pPr>
+            <w:r>
+              <w:t xml:space="preserve">05:40:04</w:t>
+            </w:r>
+          </w:p>
+        </w:tc>
+        <w:tc>
+          <w:tcPr>
+            <w:tcW w:w="1872" w:type="dxa"/>
+          </w:tcPr>
+          <w:p>
+            <w:pPr>
+              <w:spacing w:after="0"/>
+            </w:pPr>
+            <w:r>
+              <w:t xml:space="preserve">linkedin</w:t>
+            </w:r>
+          </w:p>
+        </w:tc>
+        <w:tc>
+          <w:tcPr>
+            <w:tcW w:w="1872" w:type="dxa"/>
+          </w:tcPr>
+          <w:p>
+            <w:pPr>
+              <w:spacing w:after="0"/>
+            </w:pPr>
+            <w:r>
+              <w:t xml:space="preserve">IN</w:t>
+            </w:r>
+          </w:p>
+        </w:tc>
+        <w:tc>
+          <w:tcPr>
+            <w:tcW w:w="1872" w:type="dxa"/>
+          </w:tcPr>
+          <w:p>
+            <w:pPr>
+              <w:spacing w:after="0"/>
+            </w:pPr>
+            <w:r>
+              <w:t xml:space="preserve">Windows desktop, Chrome 151</w:t>
+            </w:r>
+          </w:p>
+        </w:tc>
+        <w:tc>
+          <w:tcPr>
+            <w:tcW w:w="1872" w:type="dxa"/>
+          </w:tcPr>
+          <w:p>
+            <w:pPr>
+              <w:spacing w:after="0"/>
+            </w:pPr>
+            <w:r>
+              <w:t xml:space="preserve">no</w:t>
+            </w:r>
+          </w:p>
+        </w:tc>
+      </w:tr>
+      <w:tr>
+        <w:tc>
+          <w:tcPr>
+            <w:tcW w:w="1872" w:type="dxa"/>
+          </w:tcPr>
+          <w:p>
+            <w:pPr>
+              <w:spacing w:after="0"/>
+            </w:pPr>
+            <w:r>
+              <w:t xml:space="preserve">12:07:33</w:t>
+            </w:r>
+          </w:p>
+        </w:tc>
+        <w:tc>
+          <w:tcPr>
+            <w:tcW w:w="1872" w:type="dxa"/>
+          </w:tcPr>
+          <w:p>
+            <w:pPr>
+              <w:spacing w:after="0"/>
+            </w:pPr>
+            <w:r>
+              <w:t xml:space="preserve">linkedin</w:t>
+            </w:r>
+          </w:p>
+        </w:tc>
+        <w:tc>
+          <w:tcPr>
+            <w:tcW w:w="1872" w:type="dxa"/>
+          </w:tcPr>
+          <w:p>
+            <w:pPr>
+              <w:spacing w:after="0"/>
+            </w:pPr>
+            <w:r>
+              <w:t xml:space="preserve">IN</w:t>
+            </w:r>
+          </w:p>
+        </w:tc>
+        <w:tc>
+          <w:tcPr>
+            <w:tcW w:w="1872" w:type="dxa"/>
+          </w:tcPr>
+          <w:p>
+            <w:pPr>
+              <w:spacing w:after="0"/>
+            </w:pPr>
+            <w:r>
+              <w:t xml:space="preserve">Windows desktop, Chrome 149</w:t>
+            </w:r>
+          </w:p>
+        </w:tc>
+        <w:tc>
+          <w:tcPr>
+            <w:tcW w:w="1872" w:type="dxa"/>
+          </w:tcPr>
+          <w:p>
+            <w:pPr>
+              <w:spacing w:after="0"/>
+            </w:pPr>
+            <w:r>
+              <w:t xml:space="preserve">no</w:t>
+            </w:r>
+          </w:p>
+        </w:tc>
+      </w:tr>
+      <w:tr>
+        <w:tc>
+          <w:tcPr>
+            <w:tcW w:w="1872" w:type="dxa"/>
+          </w:tcPr>
+          <w:p>
+            <w:pPr>
+              <w:spacing w:after="0"/>
+            </w:pPr>
+            <w:r>
+              <w:t xml:space="preserve">12:08:30</w:t>
+            </w:r>
+          </w:p>
+        </w:tc>
+        <w:tc>
+          <w:tcPr>
+            <w:tcW w:w="1872" w:type="dxa"/>
+          </w:tcPr>
+          <w:p>
+            <w:pPr>
+              <w:spacing w:after="0"/>
+            </w:pPr>
+            <w:r>
+              <w:t xml:space="preserve">linkedin</w:t>
+            </w:r>
+          </w:p>
+        </w:tc>
+        <w:tc>
+          <w:tcPr>
+            <w:tcW w:w="1872" w:type="dxa"/>
+          </w:tcPr>
+          <w:p>
+            <w:pPr>
+              <w:spacing w:after="0"/>
+            </w:pPr>
+            <w:r>
+              <w:t xml:space="preserve">IN</w:t>
+            </w:r>
+          </w:p>
+        </w:tc>
+        <w:tc>
+          <w:tcPr>
+            <w:tcW w:w="1872" w:type="dxa"/>
+          </w:tcPr>
+          <w:p>
+            <w:pPr>
+              <w:spacing w:after="0"/>
+            </w:pPr>
+            <w:r>
+              <w:t xml:space="preserve">Windows desktop, Chrome 149</w:t>
+            </w:r>
+          </w:p>
+        </w:tc>
+        <w:tc>
+          <w:tcPr>
+            <w:tcW w:w="1872" w:type="dxa"/>
+          </w:tcPr>
+          <w:p>
+            <w:pPr>
+              <w:spacing w:after="0"/>
+            </w:pPr>
+            <w:r>
+              <w:t xml:space="preserve">no</w:t>
+            </w:r>
+          </w:p>
+        </w:tc>
+      </w:tr>
+    </w:tbl>
+    <w:p>
+      <w:pPr/>
+      <w:r>
+        <w:t/>
+      </w:r>
+    </w:p>
+    <w:p>
+      <w:pPr>
+        <w:spacing w:after="140"/>
+      </w:pPr>
+      <w:r>
+        <w:rPr>
+          <w:b/>
+        </w:rPr>
+        <w:t xml:space="preserve">2 distinct devices, 3 page loads. Both real people, both from India, both arriving from LinkedIn.</w:t>
+      </w:r>
+    </w:p>
+    <w:tbl>
+      <w:tblPr>
+        <w:tblStyle w:val="TableGrid"/>
+        <w:tblW w:w="9360" w:type="dxa"/>
+        <w:tblBorders>
+          <w:top w:val="single" w:sz="4" w:space="0" w:color="999999"/>
+          <w:left w:val="single" w:sz="4" w:space="0" w:color="999999"/>
+          <w:bottom w:val="single" w:sz="4" w:space="0" w:color="999999"/>
+          <w:right w:val="single" w:sz="4" w:space="0" w:color="999999"/>
+          <w:insideH w:val="single" w:sz="4" w:space="0" w:color="999999"/>
+          <w:insideV w:val="single" w:sz="4" w:space="0" w:color="999999"/>
+        </w:tblBorders>
+      </w:tblPr>
+      <w:tblGrid>
+        <w:gridCol w:w="4680"/>
+        <w:gridCol w:w="4680"/>
+      </w:tblGrid>
+      <w:tr>
+        <w:tc>
+          <w:tcPr>
+            <w:tcW w:w="4680" w:type="dxa"/>
+          </w:tcPr>
+          <w:p>
+            <w:pPr>
+              <w:spacing w:after="0"/>
+            </w:pPr>
+            <w:r>
+              <w:t xml:space="preserve">Stage</w:t>
+            </w:r>
+          </w:p>
+        </w:tc>
+        <w:tc>
+          <w:tcPr>
+            <w:tcW w:w="4680" w:type="dxa"/>
+          </w:tcPr>
+          <w:p>
+            <w:pPr>
+              <w:spacing w:after="0"/>
+            </w:pPr>
+            <w:r>
+              <w:t xml:space="preserve">Count</w:t>
+            </w:r>
+          </w:p>
+        </w:tc>
+      </w:tr>
+      <w:tr>
+        <w:tc>
+          <w:tcPr>
+            <w:tcW w:w="4680" w:type="dxa"/>
+          </w:tcPr>
+          <w:p>
+            <w:pPr>
+              <w:spacing w:after="0"/>
+            </w:pPr>
+            <w:r>
+              <w:t xml:space="preserve">Landed on the reviewer page</w:t>
+            </w:r>
+          </w:p>
+        </w:tc>
+        <w:tc>
+          <w:tcPr>
+            <w:tcW w:w="4680" w:type="dxa"/>
+          </w:tcPr>
+          <w:p>
+            <w:pPr>
+              <w:spacing w:after="0"/>
+            </w:pPr>
+            <w:r>
+              <w:rPr>
+                <w:b/>
+              </w:rPr>
+              <w:t xml:space="preserve">3</w:t>
+            </w:r>
+          </w:p>
+        </w:tc>
+      </w:tr>
+      <w:tr>
+        <w:tc>
+          <w:tcPr>
+            <w:tcW w:w="4680" w:type="dxa"/>
+          </w:tcPr>
+          <w:p>
+            <w:pPr>
+              <w:spacing w:after="0"/>
+            </w:pPr>
+            <w:r>
+              <w:t xml:space="preserve">Opened the evaluation</w:t>
+            </w:r>
+          </w:p>
+        </w:tc>
+        <w:tc>
+          <w:tcPr>
+            <w:tcW w:w="4680" w:type="dxa"/>
+          </w:tcPr>
+          <w:p>
+            <w:pPr>
+              <w:spacing w:after="0"/>
+            </w:pPr>
+            <w:r>
+              <w:rPr>
+                <w:b/>
+              </w:rPr>
+              <w:t xml:space="preserve">0</w:t>
+            </w:r>
+          </w:p>
+        </w:tc>
+      </w:tr>
+      <w:tr>
+        <w:tc>
+          <w:tcPr>
+            <w:tcW w:w="4680" w:type="dxa"/>
+          </w:tcPr>
+          <w:p>
+            <w:pPr>
+              <w:spacing w:after="0"/>
+            </w:pPr>
+            <w:r>
+              <w:t xml:space="preserve">Submitted</w:t>
+            </w:r>
+          </w:p>
+        </w:tc>
+        <w:tc>
+          <w:tcPr>
+            <w:tcW w:w="4680" w:type="dxa"/>
+          </w:tcPr>
+          <w:p>
+            <w:pPr>
+              <w:spacing w:after="0"/>
+            </w:pPr>
+            <w:r>
+              <w:rPr>
+                <w:b/>
+              </w:rPr>
+              <w:t xml:space="preserve">0</w:t>
+            </w:r>
+          </w:p>
+        </w:tc>
+      </w:tr>
+      <w:tr>
+        <w:tc>
+          <w:tcPr>
+            <w:tcW w:w="4680" w:type="dxa"/>
+          </w:tcPr>
+          <w:p>
+            <w:pPr>
+              <w:spacing w:after="0"/>
+            </w:pPr>
+            <w:r>
+              <w:t xml:space="preserve">Contact details captured</w:t>
+            </w:r>
+          </w:p>
+        </w:tc>
+        <w:tc>
+          <w:tcPr>
+            <w:tcW w:w="4680" w:type="dxa"/>
+          </w:tcPr>
+          <w:p>
+            <w:pPr>
+              <w:spacing w:after="0"/>
+            </w:pPr>
+            <w:r>
+              <w:rPr>
+                <w:b/>
+              </w:rPr>
+              <w:t xml:space="preserve">0</w:t>
+            </w:r>
+          </w:p>
+        </w:tc>
+      </w:tr>
+    </w:tbl>
+    <w:p>
+      <w:pPr/>
+      <w:r>
+        <w:t/>
+      </w:r>
+    </w:p>
+    <w:p>
+      <w:pPr>
+        <w:spacing w:after="140"/>
+      </w:pPr>
+      <w:r>
+        <w:rPr>
+          <w:b/>
+        </w:rPr>
+        <w:t xml:space="preserve">They did not open the evaluation.</w:t>
+      </w:r>
+      <w:r>
+        <w:t xml:space="preserve"> </w:t>
+      </w:r>
+      <w:r>
+        <w:rPr>
+          <w:rFonts w:ascii="Consolas" w:hAnsi="Consolas"/>
+        </w:rPr>
+        <w:t xml:space="preserve">eval-view</w:t>
+      </w:r>
+      <w:r>
+        <w:t xml:space="preserve"> rows today: 0. </w:t>
+      </w:r>
+      <w:r>
+        <w:rPr>
+          <w:rFonts w:ascii="Consolas" w:hAnsi="Consolas"/>
+        </w:rPr>
+        <w:t xml:space="preserve">pilot_contacts</w:t>
+      </w:r>
+      <w:r>
+        <w:t xml:space="preserve"> rows today: 0.</w:t>
+      </w:r>
+    </w:p>
+    <w:p>
+      <w:pPr>
+        <w:spacing w:after="140"/>
+      </w:pPr>
+      <w:r>
+        <w:rPr>
+          <w:b/>
+        </w:rPr>
+        <w:t xml:space="preserve">No, we did not get their information, and could not have.</w:t>
+      </w:r>
+      <w:r>
+        <w:t xml:space="preserve"> Contact details are requested only at the END of the evaluation, in the optional incentive block. Anyone who stops before submitting leaves no name, no email and no identifier, by design. Contacts can never exceed submissions.</w:t>
+      </w:r>
+    </w:p>
+    <w:p>
+      <w:pPr>
+        <w:pStyle w:val="Heading3"/>
+        <w:spacing w:after="140"/>
+      </w:pPr>
+      <w:r>
+        <w:t xml:space="preserve">Why they left, measured not guessed</w:t>
+      </w:r>
+    </w:p>
+    <w:p>
+      <w:pPr>
+        <w:spacing w:after="140"/>
+      </w:pPr>
+      <w:r>
+        <w:rPr>
+          <w:rFonts w:ascii="Consolas" w:hAnsi="Consolas"/>
+        </w:rPr>
+        <w:t xml:space="preserve">reviewer/index.html</w:t>
+      </w:r>
+      <w:r>
+        <w:t xml:space="preserve"> was rendered at both sizes matching the visitors' actual user agent:</w:t>
+      </w:r>
+    </w:p>
+    <w:tbl>
+      <w:tblPr>
+        <w:tblStyle w:val="TableGrid"/>
+        <w:tblW w:w="9360" w:type="dxa"/>
+        <w:tblBorders>
+          <w:top w:val="single" w:sz="4" w:space="0" w:color="999999"/>
+          <w:left w:val="single" w:sz="4" w:space="0" w:color="999999"/>
+          <w:bottom w:val="single" w:sz="4" w:space="0" w:color="999999"/>
+          <w:right w:val="single" w:sz="4" w:space="0" w:color="999999"/>
+          <w:insideH w:val="single" w:sz="4" w:space="0" w:color="999999"/>
+          <w:insideV w:val="single" w:sz="4" w:space="0" w:color="999999"/>
+        </w:tblBorders>
+      </w:tblPr>
+      <w:tblGrid>
+        <w:gridCol w:w="2340"/>
+        <w:gridCol w:w="2340"/>
+        <w:gridCol w:w="2340"/>
+        <w:gridCol w:w="2340"/>
+      </w:tblGrid>
+      <w:tr>
+        <w:tc>
+          <w:tcPr>
+            <w:tcW w:w="2340" w:type="dxa"/>
+          </w:tcPr>
+          <w:p>
+            <w:pPr>
+              <w:spacing w:after="0"/>
+            </w:pPr>
+            <w:r>
+              <w:t xml:space="preserve">Viewport</w:t>
+            </w:r>
+          </w:p>
+        </w:tc>
+        <w:tc>
+          <w:tcPr>
+            <w:tcW w:w="2340" w:type="dxa"/>
+          </w:tcPr>
+          <w:p>
+            <w:pPr>
+              <w:spacing w:after="0"/>
+            </w:pPr>
+            <w:r>
+              <w:t xml:space="preserve">Page height</w:t>
+            </w:r>
+          </w:p>
+        </w:tc>
+        <w:tc>
+          <w:tcPr>
+            <w:tcW w:w="2340" w:type="dxa"/>
+          </w:tcPr>
+          <w:p>
+            <w:pPr>
+              <w:spacing w:after="0"/>
+            </w:pPr>
+            <w:r>
+              <w:t xml:space="preserve">Evaluation CTA position</w:t>
+            </w:r>
+          </w:p>
+        </w:tc>
+        <w:tc>
+          <w:tcPr>
+            <w:tcW w:w="2340" w:type="dxa"/>
+          </w:tcPr>
+          <w:p>
+            <w:pPr>
+              <w:spacing w:after="0"/>
+            </w:pPr>
+            <w:r>
+              <w:t xml:space="preserve">Above fold</w:t>
+            </w:r>
+          </w:p>
+        </w:tc>
+      </w:tr>
+      <w:tr>
+        <w:tc>
+          <w:tcPr>
+            <w:tcW w:w="2340" w:type="dxa"/>
+          </w:tcPr>
+          <w:p>
+            <w:pPr>
+              <w:spacing w:after="0"/>
+            </w:pPr>
+            <w:r>
+              <w:t xml:space="preserve">1366x768</w:t>
+            </w:r>
+          </w:p>
+        </w:tc>
+        <w:tc>
+          <w:tcPr>
+            <w:tcW w:w="2340" w:type="dxa"/>
+          </w:tcPr>
+          <w:p>
+            <w:pPr>
+              <w:spacing w:after="0"/>
+            </w:pPr>
+            <w:r>
+              <w:t xml:space="preserve">2416px</w:t>
+            </w:r>
+          </w:p>
+        </w:tc>
+        <w:tc>
+          <w:tcPr>
+            <w:tcW w:w="2340" w:type="dxa"/>
+          </w:tcPr>
+          <w:p>
+            <w:pPr>
+              <w:spacing w:after="0"/>
+            </w:pPr>
+            <w:r>
+              <w:rPr>
+                <w:b/>
+              </w:rPr>
+              <w:t xml:space="preserve">2149px and 2205px</w:t>
+            </w:r>
+          </w:p>
+        </w:tc>
+        <w:tc>
+          <w:tcPr>
+            <w:tcW w:w="2340" w:type="dxa"/>
+          </w:tcPr>
+          <w:p>
+            <w:pPr>
+              <w:spacing w:after="0"/>
+            </w:pPr>
+            <w:r>
+              <w:rPr>
+                <w:b/>
+              </w:rPr>
+              <w:t xml:space="preserve">No</w:t>
+            </w:r>
+          </w:p>
+        </w:tc>
+      </w:tr>
+      <w:tr>
+        <w:tc>
+          <w:tcPr>
+            <w:tcW w:w="2340" w:type="dxa"/>
+          </w:tcPr>
+          <w:p>
+            <w:pPr>
+              <w:spacing w:after="0"/>
+            </w:pPr>
+            <w:r>
+              <w:t xml:space="preserve">1920x1080</w:t>
+            </w:r>
+          </w:p>
+        </w:tc>
+        <w:tc>
+          <w:tcPr>
+            <w:tcW w:w="2340" w:type="dxa"/>
+          </w:tcPr>
+          <w:p>
+            <w:pPr>
+              <w:spacing w:after="0"/>
+            </w:pPr>
+            <w:r>
+              <w:t xml:space="preserve">2416px</w:t>
+            </w:r>
+          </w:p>
+        </w:tc>
+        <w:tc>
+          <w:tcPr>
+            <w:tcW w:w="2340" w:type="dxa"/>
+          </w:tcPr>
+          <w:p>
+            <w:pPr>
+              <w:spacing w:after="0"/>
+            </w:pPr>
+            <w:r>
+              <w:rPr>
+                <w:b/>
+              </w:rPr>
+              <w:t xml:space="preserve">2149px and 2205px</w:t>
+            </w:r>
+          </w:p>
+        </w:tc>
+        <w:tc>
+          <w:tcPr>
+            <w:tcW w:w="2340" w:type="dxa"/>
+          </w:tcPr>
+          <w:p>
+            <w:pPr>
+              <w:spacing w:after="0"/>
+            </w:pPr>
+            <w:r>
+              <w:rPr>
+                <w:b/>
+              </w:rPr>
+              <w:t xml:space="preserve">No</w:t>
+            </w:r>
+          </w:p>
+        </w:tc>
+      </w:tr>
+    </w:tbl>
+    <w:p>
+      <w:pPr/>
+      <w:r>
+        <w:t/>
+      </w:r>
+    </w:p>
+    <w:p>
+      <w:pPr>
+        <w:spacing w:after="140"/>
+      </w:pPr>
+      <w:r>
+        <w:rPr>
+          <w:b/>
+        </w:rPr>
+        <w:t xml:space="preserve">The only links to the evaluation sat 89 percent of the way down the page.</w:t>
+      </w:r>
+      <w:r>
+        <w:t xml:space="preserve"> A visitor had to scroll the entire page to find one.</w:t>
+      </w:r>
+    </w:p>
+    <w:p>
+      <w:pPr>
+        <w:pStyle w:val="Heading3"/>
+        <w:spacing w:after="140"/>
+      </w:pPr>
+      <w:r>
+        <w:t xml:space="preserve">Repair</w:t>
+      </w:r>
+    </w:p>
+    <w:tbl>
+      <w:tblPr>
+        <w:tblStyle w:val="TableGrid"/>
+        <w:tblW w:w="9360" w:type="dxa"/>
+        <w:tblBorders>
+          <w:top w:val="single" w:sz="4" w:space="0" w:color="999999"/>
+          <w:left w:val="single" w:sz="4" w:space="0" w:color="999999"/>
+          <w:bottom w:val="single" w:sz="4" w:space="0" w:color="999999"/>
+          <w:right w:val="single" w:sz="4" w:space="0" w:color="999999"/>
+          <w:insideH w:val="single" w:sz="4" w:space="0" w:color="999999"/>
+          <w:insideV w:val="single" w:sz="4" w:space="0" w:color="999999"/>
+        </w:tblBorders>
+      </w:tblPr>
+      <w:tblGrid>
+        <w:gridCol w:w="4680"/>
+        <w:gridCol w:w="4680"/>
+      </w:tblGrid>
+      <w:tr>
+        <w:tc>
+          <w:tcPr>
+            <w:tcW w:w="4680" w:type="dxa"/>
+          </w:tcPr>
+          <w:p>
+            <w:pPr>
+              <w:spacing w:after="0"/>
+            </w:pPr>
+            <w:r>
+              <w:t xml:space="preserve">Change</w:t>
+            </w:r>
+          </w:p>
+        </w:tc>
+        <w:tc>
+          <w:tcPr>
+            <w:tcW w:w="4680" w:type="dxa"/>
+          </w:tcPr>
+          <w:p>
+            <w:pPr>
+              <w:spacing w:after="0"/>
+            </w:pPr>
+            <w:r>
+              <w:t xml:space="preserve">Result</w:t>
+            </w:r>
+          </w:p>
+        </w:tc>
+      </w:tr>
+      <w:tr>
+        <w:tc>
+          <w:tcPr>
+            <w:tcW w:w="4680" w:type="dxa"/>
+          </w:tcPr>
+          <w:p>
+            <w:pPr>
+              <w:spacing w:after="0"/>
+            </w:pPr>
+            <w:r>
+              <w:t xml:space="preserve">Primary CTA inserted above the fold</w:t>
+            </w:r>
+          </w:p>
+        </w:tc>
+        <w:tc>
+          <w:tcPr>
+            <w:tcW w:w="4680" w:type="dxa"/>
+          </w:tcPr>
+          <w:p>
+            <w:pPr>
+              <w:spacing w:after="0"/>
+            </w:pPr>
+            <w:r>
+              <w:t xml:space="preserve">Now at </w:t>
+            </w:r>
+            <w:r>
+              <w:rPr>
+                <w:b/>
+              </w:rPr>
+              <w:t xml:space="preserve">419px</w:t>
+            </w:r>
+            <w:r>
+              <w:t xml:space="preserve">, above the fold at both 1366x768 and 1920x1080, verified by re-render</w:t>
+            </w:r>
+          </w:p>
+        </w:tc>
+      </w:tr>
+      <w:tr>
+        <w:tc>
+          <w:tcPr>
+            <w:tcW w:w="4680" w:type="dxa"/>
+          </w:tcPr>
+          <w:p>
+            <w:pPr>
+              <w:spacing w:after="0"/>
+            </w:pPr>
+            <w:r>
+              <w:t xml:space="preserve">Bottom CTA pair reordered</w:t>
+            </w:r>
+          </w:p>
+        </w:tc>
+        <w:tc>
+          <w:tcPr>
+            <w:tcW w:w="4680" w:type="dxa"/>
+          </w:tcPr>
+          <w:p>
+            <w:pPr>
+              <w:spacing w:after="0"/>
+            </w:pPr>
+            <w:r>
+              <w:t xml:space="preserve">Evaluation is primary, Module 1 becomes the ghost secondary</w:t>
+            </w:r>
+          </w:p>
+        </w:tc>
+      </w:tr>
+      <w:tr>
+        <w:tc>
+          <w:tcPr>
+            <w:tcW w:w="4680" w:type="dxa"/>
+          </w:tcPr>
+          <w:p>
+            <w:pPr>
+              <w:spacing w:after="0"/>
+            </w:pPr>
+            <w:r>
+              <w:rPr>
+                <w:rFonts w:ascii="Consolas" w:hAnsi="Consolas"/>
+              </w:rPr>
+              <w:t xml:space="preserve">reviewer_funnel</w:t>
+            </w:r>
+            <w:r>
+              <w:t xml:space="preserve"> block added to </w:t>
+            </w:r>
+            <w:r>
+              <w:rPr>
+                <w:rFonts w:ascii="Consolas" w:hAnsi="Consolas"/>
+              </w:rPr>
+              <w:t xml:space="preserve">asset-stats</w:t>
+            </w:r>
+          </w:p>
+        </w:tc>
+        <w:tc>
+          <w:tcPr>
+            <w:tcW w:w="4680" w:type="dxa"/>
+          </w:tcPr>
+          <w:p>
+            <w:pPr>
+              <w:spacing w:after="0"/>
+            </w:pPr>
+            <w:r>
+              <w:t xml:space="preserve">Landed, opened, submitted, contacts, plus where people stop</w:t>
+            </w:r>
+          </w:p>
+        </w:tc>
+      </w:tr>
+      <w:tr>
+        <w:tc>
+          <w:tcPr>
+            <w:tcW w:w="4680" w:type="dxa"/>
+          </w:tcPr>
+          <w:p>
+            <w:pPr>
+              <w:spacing w:after="0"/>
+            </w:pPr>
+            <w:r>
+              <w:t xml:space="preserve">Today panel states the chain</w:t>
+            </w:r>
+          </w:p>
+        </w:tc>
+        <w:tc>
+          <w:tcPr>
+            <w:tcW w:w="4680" w:type="dxa"/>
+          </w:tcPr>
+          <w:p>
+            <w:pPr>
+              <w:spacing w:after="0"/>
+            </w:pPr>
+            <w:r>
+              <w:t xml:space="preserve">"3 landed to 0 opened to 0 submitted to 0 contacts, 3 stopped at the landing page"</w:t>
+            </w:r>
+          </w:p>
+        </w:tc>
+      </w:tr>
+    </w:tbl>
+    <w:p>
+      <w:pPr/>
+      <w:r>
+        <w:t/>
+      </w:r>
+    </w:p>
+    <w:p>
+      <w:pPr>
+        <w:spacing w:after="140"/>
+      </w:pPr>
+      <w:r>
+        <w:rPr>
+          <w:b/>
+        </w:rPr>
+        <w:t xml:space="preserve">Verified live:</w:t>
+      </w:r>
+      <w:r>
+        <w:t xml:space="preserve"> </w:t>
+      </w:r>
+      <w:r>
+        <w:rPr>
+          <w:rFonts w:ascii="Consolas" w:hAnsi="Consolas"/>
+        </w:rPr>
+        <w:t xml:space="preserve">drop_landing_to_open</w:t>
+      </w:r>
+      <w:r>
+        <w:t xml:space="preserve"> reads 3, above-fold CTA present on the deployed page.</w:t>
+      </w:r>
+    </w:p>
+    <w:p>
+      <w:pPr>
+        <w:pStyle w:val="Heading3"/>
+        <w:spacing w:after="140"/>
+      </w:pPr>
+      <w:r>
+        <w:t xml:space="preserve">Link-click telemetry</w:t>
+      </w:r>
+    </w:p>
+    <w:p>
+      <w:pPr>
+        <w:spacing w:after="140"/>
+      </w:pPr>
+      <w:r>
+        <w:rPr>
+          <w:b/>
+        </w:rPr>
+        <w:t xml:space="preserve">No defect found this run.</w:t>
+      </w:r>
+      <w:r>
+        <w:t xml:space="preserve"> The </w:t>
+      </w:r>
+      <w:r>
+        <w:rPr>
+          <w:rFonts w:ascii="Consolas" w:hAnsi="Consolas"/>
+        </w:rPr>
+        <w:t xml:space="preserve">reviewer-view</w:t>
+      </w:r>
+      <w:r>
+        <w:t xml:space="preserve"> arrival counter recorded all three visits correctly, with source, country, device and user agent. The telemetry worked; the page did not.</w:t>
+      </w:r>
+    </w:p>
+    <w:p>
+      <w:pPr>
+        <w:pStyle w:val="Heading3"/>
+        <w:spacing w:after="140"/>
+      </w:pPr>
+      <w:r>
+        <w:t xml:space="preserve">Trademark dossiers</w:t>
+      </w:r>
+    </w:p>
+    <w:p>
+      <w:pPr>
+        <w:spacing w:after="140"/>
+      </w:pPr>
+      <w:r>
+        <w:t xml:space="preserve">Unchanged: </w:t>
+      </w:r>
+      <w:r>
+        <w:rPr>
+          <w:b/>
+        </w:rPr>
+        <w:t xml:space="preserve">JRS REQUIRES USER INPUT, DRR REQUIRES USER INPUT.</w:t>
+      </w:r>
+    </w:p>
+    <w:p>
+      <w:pPr>
+        <w:pStyle w:val="Heading3"/>
+        <w:spacing w:after="140"/>
+      </w:pPr>
+      <w:r>
+        <w:t xml:space="preserve">Files modified</w:t>
+      </w:r>
+    </w:p>
+    <w:p>
+      <w:pPr>
+        <w:spacing w:after="140"/>
+      </w:pPr>
+      <w:r>
+        <w:rPr>
+          <w:rFonts w:ascii="Consolas" w:hAnsi="Consolas"/>
+        </w:rPr>
+        <w:t xml:space="preserve">reviewer/index.html</w:t>
+      </w:r>
+      <w:r>
+        <w:t xml:space="preserve">, </w:t>
+      </w:r>
+      <w:r>
+        <w:rPr>
+          <w:rFonts w:ascii="Consolas" w:hAnsi="Consolas"/>
+        </w:rPr>
+        <w:t xml:space="preserve">api/asset-stats.js</w:t>
+      </w:r>
+      <w:r>
+        <w:t xml:space="preserve">, </w:t>
+      </w:r>
+      <w:r>
+        <w:rPr>
+          <w:rFonts w:ascii="Consolas" w:hAnsi="Consolas"/>
+        </w:rPr>
+        <w:t xml:space="preserve">pilot-status.html</w:t>
+      </w:r>
+      <w:r>
+        <w:t xml:space="preserve">, </w:t>
+      </w:r>
+      <w:r>
+        <w:rPr>
+          <w:rFonts w:ascii="Consolas" w:hAnsi="Consolas"/>
+        </w:rPr>
+        <w:t xml:space="preserve">MASTER_TRACKER.md</w:t>
+      </w:r>
+      <w:r>
+        <w:t xml:space="preserve">, </w:t>
+      </w:r>
+      <w:r>
+        <w:rPr>
+          <w:rFonts w:ascii="Consolas" w:hAnsi="Consolas"/>
+        </w:rPr>
+        <w:t xml:space="preserve">MASTER_SYSTEM_AUDIT_AND_TRADEMARK_DOSSIER.md</w:t>
+      </w:r>
+      <w:r>
+        <w:t xml:space="preserve">, </w:t>
+      </w:r>
+      <w:r>
+        <w:rPr>
+          <w:rFonts w:ascii="Consolas" w:hAnsi="Consolas"/>
+        </w:rPr>
+        <w:t xml:space="preserve">research/MASTER_TRACKER.md</w:t>
+      </w:r>
+      <w:r>
+        <w:t xml:space="preserve">.</w:t>
       </w:r>
     </w:p>
     <w:p>

</xml_diff>

<commit_message>
Update both summary documents with the completed-evaluations section
Both carry the identical section so the documents and the site read from one
source. Also clears a banned word found in pre-existing text.

Co-Authored-By: Claude Opus 5 <noreply@anthropic.com>
Claude-Session: https://claude.ai/code/session_01W9UtE7X76spacWeSvBH7tv
</commit_message>
<xml_diff>
--- a/MASTER_TRACKER.docx
+++ b/MASTER_TRACKER.docx
@@ -4957,6 +4957,575 @@
           <w:rFonts w:ascii="Consolas" w:hAnsi="Consolas"/>
         </w:rPr>
         <w:t xml:space="preserve">MASTER_SYSTEM_AUDIT_AND_TRADEMARK_DOSSIER.md</w:t>
+      </w:r>
+      <w:r>
+        <w:t xml:space="preserve">, </w:t>
+      </w:r>
+      <w:r>
+        <w:rPr>
+          <w:rFonts w:ascii="Consolas" w:hAnsi="Consolas"/>
+        </w:rPr>
+        <w:t xml:space="preserve">research/MASTER_TRACKER.md</w:t>
+      </w:r>
+      <w:r>
+        <w:t xml:space="preserve">.</w:t>
+      </w:r>
+    </w:p>
+    <w:p>
+      <w:pPr>
+        <w:pBdr>
+          <w:bottom w:val="single" w:sz="6" w:space="1" w:color="AAAAAA"/>
+        </w:pBdr>
+      </w:pPr>
+    </w:p>
+    <w:p>
+      <w:pPr>
+        <w:pStyle w:val="Heading2"/>
+        <w:spacing w:after="140"/>
+      </w:pPr>
+      <w:r>
+        <w:t xml:space="preserve">Run: 2026-08-12T12:42:55Z</w:t>
+      </w:r>
+    </w:p>
+    <w:p>
+      <w:pPr>
+        <w:spacing w:after="140"/>
+      </w:pPr>
+      <w:r>
+        <w:rPr>
+          <w:b/>
+        </w:rPr>
+        <w:t xml:space="preserve">Counter audit: PASSED. New publication added. No telemetry defect found this run.</w:t>
+      </w:r>
+    </w:p>
+    <w:p>
+      <w:pPr>
+        <w:pStyle w:val="Heading3"/>
+        <w:spacing w:after="140"/>
+      </w:pPr>
+      <w:r>
+        <w:t xml:space="preserve">Request</w:t>
+      </w:r>
+    </w:p>
+    <w:p>
+      <w:pPr>
+        <w:spacing w:after="140"/>
+      </w:pPr>
+      <w:r>
+        <w:t xml:space="preserve">Publish on </w:t>
+      </w:r>
+      <w:r>
+        <w:rPr>
+          <w:rFonts w:ascii="Consolas" w:hAnsi="Consolas"/>
+        </w:rPr>
+        <w:t xml:space="preserve">pilot-status.html</w:t>
+      </w:r>
+      <w:r>
+        <w:t xml:space="preserve"> how many evaluations were completed and who completed them, plus the purpose of collecting the results. Update the two summary documents.</w:t>
+      </w:r>
+    </w:p>
+    <w:p>
+      <w:pPr>
+        <w:pStyle w:val="Heading3"/>
+        <w:spacing w:after="140"/>
+      </w:pPr>
+      <w:r>
+        <w:t xml:space="preserve">Delivered</w:t>
+      </w:r>
+    </w:p>
+    <w:p>
+      <w:pPr>
+        <w:spacing w:after="140"/>
+      </w:pPr>
+      <w:r>
+        <w:t xml:space="preserve">New </w:t>
+      </w:r>
+      <w:r>
+        <w:rPr>
+          <w:b/>
+        </w:rPr>
+        <w:t xml:space="preserve">Completed Evaluations</w:t>
+      </w:r>
+      <w:r>
+        <w:t xml:space="preserve"> panel, live, with four tiles and two blocks:</w:t>
+      </w:r>
+    </w:p>
+    <w:tbl>
+      <w:tblPr>
+        <w:tblStyle w:val="TableGrid"/>
+        <w:tblW w:w="9360" w:type="dxa"/>
+        <w:tblBorders>
+          <w:top w:val="single" w:sz="4" w:space="0" w:color="999999"/>
+          <w:left w:val="single" w:sz="4" w:space="0" w:color="999999"/>
+          <w:bottom w:val="single" w:sz="4" w:space="0" w:color="999999"/>
+          <w:right w:val="single" w:sz="4" w:space="0" w:color="999999"/>
+          <w:insideH w:val="single" w:sz="4" w:space="0" w:color="999999"/>
+          <w:insideV w:val="single" w:sz="4" w:space="0" w:color="999999"/>
+        </w:tblBorders>
+      </w:tblPr>
+      <w:tblGrid>
+        <w:gridCol w:w="4680"/>
+        <w:gridCol w:w="4680"/>
+      </w:tblGrid>
+      <w:tr>
+        <w:tc>
+          <w:tcPr>
+            <w:tcW w:w="4680" w:type="dxa"/>
+          </w:tcPr>
+          <w:p>
+            <w:pPr>
+              <w:spacing w:after="0"/>
+            </w:pPr>
+            <w:r>
+              <w:t xml:space="preserve">Element</w:t>
+            </w:r>
+          </w:p>
+        </w:tc>
+        <w:tc>
+          <w:tcPr>
+            <w:tcW w:w="4680" w:type="dxa"/>
+          </w:tcPr>
+          <w:p>
+            <w:pPr>
+              <w:spacing w:after="0"/>
+            </w:pPr>
+            <w:r>
+              <w:t xml:space="preserve">Source</w:t>
+            </w:r>
+          </w:p>
+        </w:tc>
+      </w:tr>
+      <w:tr>
+        <w:tc>
+          <w:tcPr>
+            <w:tcW w:w="4680" w:type="dxa"/>
+          </w:tcPr>
+          <w:p>
+            <w:pPr>
+              <w:spacing w:after="0"/>
+            </w:pPr>
+            <w:r>
+              <w:t xml:space="preserve">Evaluations completed</w:t>
+            </w:r>
+          </w:p>
+        </w:tc>
+        <w:tc>
+          <w:tcPr>
+            <w:tcW w:w="4680" w:type="dxa"/>
+          </w:tcPr>
+          <w:p>
+            <w:pPr>
+              <w:spacing w:after="0"/>
+            </w:pPr>
+            <w:r>
+              <w:rPr>
+                <w:rFonts w:ascii="Consolas" w:hAnsi="Consolas"/>
+              </w:rPr>
+              <w:t xml:space="preserve">completed_evaluations.submitted</w:t>
+            </w:r>
+          </w:p>
+        </w:tc>
+      </w:tr>
+      <w:tr>
+        <w:tc>
+          <w:tcPr>
+            <w:tcW w:w="4680" w:type="dxa"/>
+          </w:tcPr>
+          <w:p>
+            <w:pPr>
+              <w:spacing w:after="0"/>
+            </w:pPr>
+            <w:r>
+              <w:t xml:space="preserve">Answered all nine</w:t>
+            </w:r>
+          </w:p>
+        </w:tc>
+        <w:tc>
+          <w:tcPr>
+            <w:tcW w:w="4680" w:type="dxa"/>
+          </w:tcPr>
+          <w:p>
+            <w:pPr>
+              <w:spacing w:after="0"/>
+            </w:pPr>
+            <w:r>
+              <w:rPr>
+                <w:rFonts w:ascii="Consolas" w:hAnsi="Consolas"/>
+              </w:rPr>
+              <w:t xml:space="preserve">completed_evaluations.answered_all_nine</w:t>
+            </w:r>
+          </w:p>
+        </w:tc>
+      </w:tr>
+      <w:tr>
+        <w:tc>
+          <w:tcPr>
+            <w:tcW w:w="4680" w:type="dxa"/>
+          </w:tcPr>
+          <w:p>
+            <w:pPr>
+              <w:spacing w:after="0"/>
+            </w:pPr>
+            <w:r>
+              <w:t xml:space="preserve">Chose to be named</w:t>
+            </w:r>
+          </w:p>
+        </w:tc>
+        <w:tc>
+          <w:tcPr>
+            <w:tcW w:w="4680" w:type="dxa"/>
+          </w:tcPr>
+          <w:p>
+            <w:pPr>
+              <w:spacing w:after="0"/>
+            </w:pPr>
+            <w:r>
+              <w:rPr>
+                <w:rFonts w:ascii="Consolas" w:hAnsi="Consolas"/>
+              </w:rPr>
+              <w:t xml:space="preserve">completed_evaluations.named_publicly</w:t>
+            </w:r>
+          </w:p>
+        </w:tc>
+      </w:tr>
+      <w:tr>
+        <w:tc>
+          <w:tcPr>
+            <w:tcW w:w="4680" w:type="dxa"/>
+          </w:tcPr>
+          <w:p>
+            <w:pPr>
+              <w:spacing w:after="0"/>
+            </w:pPr>
+            <w:r>
+              <w:t xml:space="preserve">Chose to stay anonymous</w:t>
+            </w:r>
+          </w:p>
+        </w:tc>
+        <w:tc>
+          <w:tcPr>
+            <w:tcW w:w="4680" w:type="dxa"/>
+          </w:tcPr>
+          <w:p>
+            <w:pPr>
+              <w:spacing w:after="0"/>
+            </w:pPr>
+            <w:r>
+              <w:rPr>
+                <w:rFonts w:ascii="Consolas" w:hAnsi="Consolas"/>
+              </w:rPr>
+              <w:t xml:space="preserve">completed_evaluations.chose_to_stay_anonymous</w:t>
+            </w:r>
+          </w:p>
+        </w:tc>
+      </w:tr>
+      <w:tr>
+        <w:tc>
+          <w:tcPr>
+            <w:tcW w:w="4680" w:type="dxa"/>
+          </w:tcPr>
+          <w:p>
+            <w:pPr>
+              <w:spacing w:after="0"/>
+            </w:pPr>
+            <w:r>
+              <w:t xml:space="preserve">Who completed one</w:t>
+            </w:r>
+          </w:p>
+        </w:tc>
+        <w:tc>
+          <w:tcPr>
+            <w:tcW w:w="4680" w:type="dxa"/>
+          </w:tcPr>
+          <w:p>
+            <w:pPr>
+              <w:spacing w:after="0"/>
+            </w:pPr>
+            <w:r>
+              <w:rPr>
+                <w:rFonts w:ascii="Consolas" w:hAnsi="Consolas"/>
+              </w:rPr>
+              <w:t xml:space="preserve">completed_evaluations.names</w:t>
+            </w:r>
+            <w:r>
+              <w:t xml:space="preserve">, consent-gated</w:t>
+            </w:r>
+          </w:p>
+        </w:tc>
+      </w:tr>
+      <w:tr>
+        <w:tc>
+          <w:tcPr>
+            <w:tcW w:w="4680" w:type="dxa"/>
+          </w:tcPr>
+          <w:p>
+            <w:pPr>
+              <w:spacing w:after="0"/>
+            </w:pPr>
+            <w:r>
+              <w:t xml:space="preserve">What the results are collected for</w:t>
+            </w:r>
+          </w:p>
+        </w:tc>
+        <w:tc>
+          <w:tcPr>
+            <w:tcW w:w="4680" w:type="dxa"/>
+          </w:tcPr>
+          <w:p>
+            <w:pPr>
+              <w:spacing w:after="0"/>
+            </w:pPr>
+            <w:r>
+              <w:rPr>
+                <w:rFonts w:ascii="Consolas" w:hAnsi="Consolas"/>
+              </w:rPr>
+              <w:t xml:space="preserve">completed_evaluations.purpose</w:t>
+            </w:r>
+          </w:p>
+        </w:tc>
+      </w:tr>
+    </w:tbl>
+    <w:p>
+      <w:pPr/>
+      <w:r>
+        <w:t/>
+      </w:r>
+    </w:p>
+    <w:p>
+      <w:pPr>
+        <w:spacing w:after="140"/>
+      </w:pPr>
+      <w:r>
+        <w:t xml:space="preserve">All four tiles read </w:t>
+      </w:r>
+      <w:r>
+        <w:rPr>
+          <w:b/>
+        </w:rPr>
+        <w:t xml:space="preserve">0</w:t>
+      </w:r>
+      <w:r>
+        <w:t xml:space="preserve">. True zero: the instrument is live, the write path was verified against production, and it has not been sent to anyone.</w:t>
+      </w:r>
+    </w:p>
+    <w:p>
+      <w:pPr>
+        <w:pStyle w:val="Heading3"/>
+        <w:spacing w:after="140"/>
+      </w:pPr>
+      <w:r>
+        <w:t xml:space="preserve">The constraint on "who completed them", stated rather than worked around</w:t>
+      </w:r>
+    </w:p>
+    <w:p>
+      <w:pPr>
+        <w:spacing w:after="140"/>
+      </w:pPr>
+      <w:r>
+        <w:rPr>
+          <w:b/>
+        </w:rPr>
+        <w:t xml:space="preserve">Only the names of people who ticked "Optional: list my name publicly as a JRS-trained reviewer" can be published, and those are what the panel shows.</w:t>
+      </w:r>
+    </w:p>
+    <w:p>
+      <w:pPr>
+        <w:spacing w:after="140"/>
+      </w:pPr>
+      <w:r>
+        <w:t xml:space="preserve">Answers live in </w:t>
+      </w:r>
+      <w:r>
+        <w:rPr>
+          <w:rFonts w:ascii="Consolas" w:hAnsi="Consolas"/>
+        </w:rPr>
+        <w:t xml:space="preserve">interaction_events</w:t>
+      </w:r>
+      <w:r>
+        <w:t xml:space="preserve"> with no identity on the row. Identities live in </w:t>
+      </w:r>
+      <w:r>
+        <w:rPr>
+          <w:rFonts w:ascii="Consolas" w:hAnsi="Consolas"/>
+        </w:rPr>
+        <w:t xml:space="preserve">pilot_contacts</w:t>
+      </w:r>
+      <w:r>
+        <w:t xml:space="preserve"> with no answers on the row. </w:t>
+      </w:r>
+      <w:r>
+        <w:rPr>
+          <w:b/>
+        </w:rPr>
+        <w:t xml:space="preserve">The two tables share no key.</w:t>
+      </w:r>
+      <w:r>
+        <w:t xml:space="preserve"> Nobody, including the person running the study, can say which respondent gave which answers. That is the promise the instrument makes on its own page.</w:t>
+      </w:r>
+    </w:p>
+    <w:p>
+      <w:pPr>
+        <w:spacing w:after="140"/>
+      </w:pPr>
+      <w:r>
+        <w:t xml:space="preserve">Publishing who gave which answers would require rebuilding the instrument to collect something it was specifically built not to collect. The panel publishes the identity limit alongside the names so a reader is never left to assume the omission is an oversight.</w:t>
+      </w:r>
+    </w:p>
+    <w:p>
+      <w:pPr>
+        <w:pStyle w:val="Heading3"/>
+        <w:spacing w:after="140"/>
+      </w:pPr>
+      <w:r>
+        <w:t xml:space="preserve">Purpose of collection, now published</w:t>
+      </w:r>
+    </w:p>
+    <w:p>
+      <w:pPr>
+        <w:spacing w:after="140"/>
+      </w:pPr>
+      <w:r>
+        <w:t xml:space="preserve">Aggregate reporting in the research write-up; full results to every reviewer once the study closes; evidence base describing the problem the standard addresses. </w:t>
+      </w:r>
+      <w:r>
+        <w:rPr>
+          <w:b/>
+        </w:rPr>
+        <w:t xml:space="preserve">Not used to evaluate, rank or identify any respondent or their employer.</w:t>
+      </w:r>
+    </w:p>
+    <w:p>
+      <w:pPr>
+        <w:pStyle w:val="Heading3"/>
+        <w:spacing w:after="140"/>
+      </w:pPr>
+      <w:r>
+        <w:t xml:space="preserve">Documents updated</w:t>
+      </w:r>
+    </w:p>
+    <w:p>
+      <w:pPr>
+        <w:spacing w:after="140"/>
+      </w:pPr>
+      <w:r>
+        <w:rPr>
+          <w:rFonts w:ascii="Consolas" w:hAnsi="Consolas"/>
+        </w:rPr>
+        <w:t xml:space="preserve">research/Reviewer_Evaluation_Summary_2026-08-11.md</w:t>
+      </w:r>
+      <w:r>
+        <w:t xml:space="preserve"> 8,538 to 11,526 bytes. </w:t>
+      </w:r>
+      <w:r>
+        <w:rPr>
+          <w:rFonts w:ascii="Consolas" w:hAnsi="Consolas"/>
+        </w:rPr>
+        <w:t xml:space="preserve">research/Reviewer_Program_Summary_2026-08-09.md</w:t>
+      </w:r>
+      <w:r>
+        <w:t xml:space="preserve"> 16,768 to 19,756 bytes. Both carry the same section, so the documents and the site read from one source.</w:t>
+      </w:r>
+    </w:p>
+    <w:p>
+      <w:pPr>
+        <w:pStyle w:val="Heading3"/>
+        <w:spacing w:after="140"/>
+      </w:pPr>
+      <w:r>
+        <w:t xml:space="preserve">Link-click telemetry</w:t>
+      </w:r>
+    </w:p>
+    <w:p>
+      <w:pPr>
+        <w:spacing w:after="140"/>
+      </w:pPr>
+      <w:r>
+        <w:rPr>
+          <w:b/>
+        </w:rPr>
+        <w:t xml:space="preserve">No defect found this run.</w:t>
+      </w:r>
+      <w:r>
+        <w:t xml:space="preserve"> No code path was changed.</w:t>
+      </w:r>
+    </w:p>
+    <w:p>
+      <w:pPr>
+        <w:pStyle w:val="Heading3"/>
+        <w:spacing w:after="140"/>
+      </w:pPr>
+      <w:r>
+        <w:t xml:space="preserve">Trademark dossiers</w:t>
+      </w:r>
+    </w:p>
+    <w:p>
+      <w:pPr>
+        <w:spacing w:after="140"/>
+      </w:pPr>
+      <w:r>
+        <w:t xml:space="preserve">Unchanged: </w:t>
+      </w:r>
+      <w:r>
+        <w:rPr>
+          <w:b/>
+        </w:rPr>
+        <w:t xml:space="preserve">JRS REQUIRES USER INPUT, DRR REQUIRES USER INPUT.</w:t>
+      </w:r>
+    </w:p>
+    <w:p>
+      <w:pPr>
+        <w:pStyle w:val="Heading3"/>
+        <w:spacing w:after="140"/>
+      </w:pPr>
+      <w:r>
+        <w:t xml:space="preserve">Files modified</w:t>
+      </w:r>
+    </w:p>
+    <w:p>
+      <w:pPr>
+        <w:spacing w:after="140"/>
+      </w:pPr>
+      <w:r>
+        <w:rPr>
+          <w:rFonts w:ascii="Consolas" w:hAnsi="Consolas"/>
+        </w:rPr>
+        <w:t xml:space="preserve">api/asset-stats.js</w:t>
+      </w:r>
+      <w:r>
+        <w:t xml:space="preserve">, </w:t>
+      </w:r>
+      <w:r>
+        <w:rPr>
+          <w:rFonts w:ascii="Consolas" w:hAnsi="Consolas"/>
+        </w:rPr>
+        <w:t xml:space="preserve">pilot-status.html</w:t>
+      </w:r>
+      <w:r>
+        <w:t xml:space="preserve">, </w:t>
+      </w:r>
+      <w:r>
+        <w:rPr>
+          <w:rFonts w:ascii="Consolas" w:hAnsi="Consolas"/>
+        </w:rPr>
+        <w:t xml:space="preserve">research/Reviewer_Evaluation_Summary_2026-08-11.md</w:t>
+      </w:r>
+      <w:r>
+        <w:t xml:space="preserve">, </w:t>
+      </w:r>
+      <w:r>
+        <w:rPr>
+          <w:rFonts w:ascii="Consolas" w:hAnsi="Consolas"/>
+        </w:rPr>
+        <w:t xml:space="preserve">research/Reviewer_Program_Summary_2026-08-09.md</w:t>
+      </w:r>
+      <w:r>
+        <w:t xml:space="preserve">, </w:t>
+      </w:r>
+      <w:r>
+        <w:rPr>
+          <w:rFonts w:ascii="Consolas" w:hAnsi="Consolas"/>
+        </w:rPr>
+        <w:t xml:space="preserve">MASTER_TRACKER.md</w:t>
       </w:r>
       <w:r>
         <w:t xml:space="preserve">, </w:t>

</xml_diff>